<commit_message>
fix: updated manually spaced docx templates
</commit_message>
<xml_diff>
--- a/Backend/templates/CV of Humres.docx
+++ b/Backend/templates/CV of Humres.docx
@@ -239,11 +239,7 @@
         </w:tc>
       </w:tr>
     </w:tbl>
-    <w:p>
-      <w:pPr>
-        <w:spacing w:after="100"/>
-      </w:pPr>
-    </w:p>
+    <w:p/>
     <w:tbl>
       <w:tblPr>
         <w:tblW w:w="5000" w:type="pct"/>
@@ -282,12 +278,6 @@
     </w:tbl>
     <w:p>
       <w:pPr>
-        <w:spacing w:after="120"/>
-      </w:pPr>
-    </w:p>
-    <w:p>
-      <w:pPr>
-        <w:spacing w:after="200"/>
         <w:rPr>
           <w:rFonts w:ascii="Calibri" w:hAnsi="Calibri" w:cs="Calibri"/>
           <w:color w:val="000000"/>
@@ -910,7 +900,6 @@
     </w:p>
     <w:p>
       <w:pPr>
-        <w:spacing w:after="120"/>
         <w:rPr>
           <w:rFonts w:ascii="Calibri" w:hAnsi="Calibri" w:cs="Calibri"/>
           <w:b/>
@@ -931,19 +920,6 @@
         </w:rPr>
         <w:t>Certifications and Training</w:t>
       </w:r>
-    </w:p>
-    <w:p>
-      <w:pPr>
-        <w:spacing w:after="120"/>
-        <w:rPr>
-          <w:rFonts w:ascii="Calibri" w:hAnsi="Calibri" w:cs="Calibri"/>
-          <w:b/>
-          <w:bCs/>
-          <w:sz w:val="22"/>
-          <w:szCs w:val="22"/>
-          <w:lang w:val="en-IN"/>
-        </w:rPr>
-      </w:pPr>
     </w:p>
     <w:tbl>
       <w:tblPr>
@@ -983,12 +959,6 @@
     </w:tbl>
     <w:p>
       <w:pPr>
-        <w:spacing w:after="120"/>
-      </w:pPr>
-    </w:p>
-    <w:p>
-      <w:pPr>
-        <w:spacing w:after="60"/>
         <w:rPr>
           <w:rFonts w:ascii="Calibri" w:hAnsi="Calibri" w:cs="Calibri"/>
           <w:bCs/>
@@ -1252,23 +1222,13 @@
       </w:rPr>
       <w:tab/>
     </w:r>
-    <w:proofErr w:type="spellStart"/>
     <w:r>
       <w:rPr>
         <w:rFonts w:ascii="Calibri" w:hAnsi="Calibri" w:cs="Calibri"/>
         <w:b/>
         <w:bCs/>
       </w:rPr>
-      <w:t>Humres</w:t>
-    </w:r>
-    <w:proofErr w:type="spellEnd"/>
-    <w:r>
-      <w:rPr>
-        <w:rFonts w:ascii="Calibri" w:hAnsi="Calibri" w:cs="Calibri"/>
-        <w:b/>
-        <w:bCs/>
-      </w:rPr>
-      <w:t xml:space="preserve"> Technical Recruitment Limited</w:t>
+      <w:t>Humres Technical Recruitment Limited</w:t>
     </w:r>
   </w:p>
   <w:p>

</xml_diff>